<commit_message>
Title 2 proposal: 21 references
</commit_message>
<xml_diff>
--- a/Software Engineering 1/TS31_Statisfied_Title2_VMDaet_Proposal.docx
+++ b/Software Engineering 1/TS31_Statisfied_Title2_VMDaet_Proposal.docx
@@ -1467,7 +1467,7 @@
               <w:rPr>
                 <w:rFonts w:cs="Times New Roman"/>
               </w:rPr>
-              <w:t>How the loss is defined and how its penalty is set. For billing i, let the error be the predicted days minus the actual days. The loss for that billing is its weight times the squared error, and when the prediction is too early (negative error) the squared error is multiplied by a penalty k of at least 1. The weight is the billing amount divided by the median billing amount, capped at an upper limit so that one very large billing cannot dominate training; the cap is itself tested. Setting k to 1 and every weight to 1 gives the ordinary squared loss, which is the unmodified control.</w:t>
+              <w:t>How the loss is defined and how its penalty is set. For billing i, let the error be the predicted days minus the actual days. The loss for that billing is its weight times the squared error, and when the prediction is too early (negative error) the squared error is multiplied by a penalty k of at least 1. The weight is the billing amount divided by the median billing amount, capped at an upper limit so that one very large billing cannot dominate training; the cap is itself tested. Setting k to 1 and every weight to 1 gives the ordinary squared loss, which is the unmodified control. The asymmetric squared loss is the expectile loss (Newey &amp; Powell, 1987), and the quantile loss used in variant D comes from quantile regression (Koenker &amp; Bassett, 1978).</w:t>
             </w:r>
           </w:p>
           <w:p>
@@ -1498,7 +1498,7 @@
               <w:rPr>
                 <w:rFonts w:cs="Times New Roman"/>
               </w:rPr>
-              <w:t xml:space="preserve">Implementation. The loss is implemented as a custom objective in the chosen gradient boosting library, with first derivative 2 x w x a x error and second derivative 2 x w x a, where a is k when the prediction is too early and 1 otherwise (one fixed convention is used at zero error); the median billing amount comes from training billings only, the weight cap is chosen on validation billings, and predictions are kept at zero days or more (Laimighofer et al., 2022). </w:t>
+              <w:t xml:space="preserve">Implementation. The loss is implemented as a custom objective in the chosen gradient boosting library (Friedman, 2001; for example XGBoost, Chen &amp; Guestrin, 2016), with first derivative 2 x w x a x error and second derivative 2 x w x a, where a is k when the prediction is too early and 1 otherwise (one fixed convention is used at zero error); the median billing amount comes from training billings only, the weight cap is chosen on validation billings, and predictions are kept at zero days or more (Laimighofer et al., 2022). </w:t>
             </w:r>
           </w:p>
           <w:p>
@@ -1522,7 +1522,7 @@
               <w:rPr>
                 <w:rFonts w:cs="Times New Roman"/>
               </w:rPr>
-              <w:t>Training and testing. Training uses an expanding window: at each training cutoff date only billings whose payment date is on or before the cutoff count as completed training examples, so a billing issued before the cutoff but paid after it is not used as a known outcome; the firm's past payment behaviour used as a predictor, the median billing amount and any scaling are computed from those billings only. Testing uses later billings, repeated over several forward windows (the number depends on how many billings exist), and a final test period is kept untouched until the model, k and the weight cap are fixed on validation windows.</w:t>
+              <w:t>Training and testing. Training uses an expanding window (Hyndman &amp; Athanasopoulos, 2021): at each training cutoff date only billings whose payment date is on or before the cutoff count as completed training examples, so a billing issued before the cutoff but paid after it is not used as a known outcome; the firm's past payment behaviour used as a predictor, the median billing amount and any scaling are computed from those billings only. Testing uses later billings, repeated over several forward windows (the number depends on how many billings exist), and a final test period is kept untouched until the model, k and the weight cap are fixed on validation windows.</w:t>
             </w:r>
           </w:p>
           <w:p>
@@ -1534,7 +1534,7 @@
               <w:rPr>
                 <w:rFonts w:cs="Times New Roman"/>
               </w:rPr>
-              <w:t>Comparison. The proposed model is compared with these variants so that the effect of each part is measured separately: (A) the firm's average payment delay; (B) gradient boosting with standard squared loss; (C) gradient boosting with absolute loss; (D) gradient boosting with a quantile loss; (E) amount weights only; (F) asymmetric penalty only; (G) both together, which is the proposed model; and (H) one other algorithm such as a random forest. All models get the same predictors, the same chronological windows and the same tuning effort. The quantile level in D is chosen on validation billings by the same rule used for k, the firm's average delay in A is computed only from earlier, already-paid billings, and variant C is optional if the literature gives no reason to keep it. As a simple extra reference, B with a constant number of days added to its predictions (B+shift, the shift chosen on validation by the same rule as k) is also reported, because predicting later by a fixed amount is the easiest way to lower U, and G has to do better than that.</w:t>
+              <w:t>Comparison. The proposed model is compared with these variants so that the effect of each part is measured separately: (A) the firm's average payment delay; (B) gradient boosting with standard squared loss; (C) gradient boosting with absolute loss; (D) gradient boosting with a quantile loss; (E) amount weights only; (F) asymmetric penalty only; (G) both together, which is the proposed model; and (H) one other algorithm such as a random forest (Breiman, 2001). All models get the same predictors, the same chronological windows and the same tuning effort. The quantile level in D is chosen on validation billings by the same rule used for k, the firm's average delay in A is computed only from earlier, already-paid billings, and variant C is optional if the literature gives no reason to keep it. As a simple extra reference, B with a constant number of days added to its predictions (B+shift, the shift chosen on validation by the same rule as k) is also reported, because predicting later by a fixed amount is the easiest way to lower U, and G has to do better than that.</w:t>
             </w:r>
           </w:p>
           <w:p>
@@ -2390,16 +2390,16 @@
               <w:rPr>
                 <w:rFonts w:cs="Times New Roman"/>
               </w:rPr>
-              <w:t xml:space="preserve">Egwim, C. N., Alaka, H., Toriola-Coker, L. O., Balogun, H., &amp; Sunmola, F. (2021). Applied artificial intelligence for predicting construction projects delay. </w:t>
+              <w:t xml:space="preserve">Breiman, L. (2001). Random forests. </w:t>
             </w:r>
             <w:r>
               <w:rPr>
                 <w:i/>
               </w:rPr>
-              <w:t>Machine Learning with Applications, 6</w:t>
-            </w:r>
-            <w:r>
-              <w:t>, Article 100166. https://doi.org/10.1016/j.mlwa.2021.100166</w:t>
+              <w:t>Machine Learning, 45</w:t>
+            </w:r>
+            <w:r>
+              <w:t>(1), 5–32. https://doi.org/10.1023/A:1010933404324</w:t>
             </w:r>
           </w:p>
           <w:p>
@@ -2411,16 +2411,16 @@
               <w:rPr>
                 <w:rFonts w:cs="Times New Roman"/>
               </w:rPr>
-              <w:t xml:space="preserve">Fouad, A. M., Wefki, H., &amp; Kouta, H. (2025). AI-driven raw material demand forecasting: Towards project management practices. </w:t>
+              <w:t xml:space="preserve">Chen, T., &amp; Guestrin, C. (2016). XGBoost: A scalable tree boosting system. In </w:t>
             </w:r>
             <w:r>
               <w:rPr>
                 <w:i/>
               </w:rPr>
-              <w:t>Journal of Supply Chain Management Science, 6</w:t>
-            </w:r>
-            <w:r>
-              <w:t>(1–2). https://doi.org/10.59490/jscms.2025.8136</w:t>
+              <w:t>Proceedings of the 22nd ACM SIGKDD International Conference on Knowledge Discovery and Data Mining</w:t>
+            </w:r>
+            <w:r>
+              <w:t> (pp. 785–794). ACM. https://doi.org/10.1145/2939672.2939785</w:t>
             </w:r>
           </w:p>
           <w:p>
@@ -2432,16 +2432,16 @@
               <w:rPr>
                 <w:rFonts w:cs="Times New Roman"/>
               </w:rPr>
-              <w:t xml:space="preserve">Laimighofer, J., Melcher, M., &amp; Laaha, G. (2022). Low-flow estimation beyond the mean – expectile loss and extreme gradient boosting for spatiotemporal low-flow prediction in Austria. </w:t>
+              <w:t xml:space="preserve">Egwim, C. N., Alaka, H., Toriola-Coker, L. O., Balogun, H., &amp; Sunmola, F. (2021). Applied artificial intelligence for predicting construction projects delay. </w:t>
             </w:r>
             <w:r>
               <w:rPr>
                 <w:i/>
               </w:rPr>
-              <w:t>Hydrology and Earth System Sciences, 26</w:t>
-            </w:r>
-            <w:r>
-              <w:t>(17), 4553–4574. https://doi.org/10.5194/hess-26-4553-2022</w:t>
+              <w:t>Machine Learning with Applications, 6</w:t>
+            </w:r>
+            <w:r>
+              <w:t>, Article 100166. https://doi.org/10.1016/j.mlwa.2021.100166</w:t>
             </w:r>
           </w:p>
           <w:p>
@@ -2453,16 +2453,16 @@
               <w:rPr>
                 <w:rFonts w:cs="Times New Roman"/>
               </w:rPr>
-              <w:t xml:space="preserve">Masnadi-Shirazi, H., &amp; Vasconcelos, N. (2011). Cost-sensitive boosting. </w:t>
+              <w:t xml:space="preserve">Fouad, A. M., Wefki, H., &amp; Kouta, H. (2025). AI-driven raw material demand forecasting: Towards project management practices. </w:t>
             </w:r>
             <w:r>
               <w:rPr>
                 <w:i/>
               </w:rPr>
-              <w:t>IEEE Transactions on Pattern Analysis and Machine Intelligence, 33</w:t>
-            </w:r>
-            <w:r>
-              <w:t>(2), 294–309. https://doi.org/10.1109/TPAMI.2010.71</w:t>
+              <w:t>Journal of Supply Chain Management Science, 6</w:t>
+            </w:r>
+            <w:r>
+              <w:t>(1–2). https://doi.org/10.59490/jscms.2025.8136</w:t>
             </w:r>
           </w:p>
           <w:p>
@@ -2474,6 +2474,111 @@
               <w:rPr>
                 <w:rFonts w:cs="Times New Roman"/>
               </w:rPr>
+              <w:t xml:space="preserve">Friedman, J. H. (2001). Greedy function approximation: A gradient boosting machine. </w:t>
+            </w:r>
+            <w:r>
+              <w:rPr>
+                <w:i/>
+              </w:rPr>
+              <w:t>The Annals of Statistics, 29</w:t>
+            </w:r>
+            <w:r>
+              <w:t>(5), 1189–1232. https://doi.org/10.1214/aos/1013203451</w:t>
+            </w:r>
+          </w:p>
+          <w:p>
+            <w:pPr>
+              <w:spacing w:after="120"/>
+              <w:ind w:left="720" w:hanging="720"/>
+            </w:pPr>
+            <w:r>
+              <w:rPr>
+                <w:rFonts w:cs="Times New Roman"/>
+              </w:rPr>
+              <w:t xml:space="preserve">Hyndman, R. J., &amp; Athanasopoulos, G. (2021). </w:t>
+            </w:r>
+            <w:r>
+              <w:rPr>
+                <w:i/>
+              </w:rPr>
+              <w:t>Forecasting: Principles and practice</w:t>
+            </w:r>
+            <w:r>
+              <w:t> (3rd ed.). OTexts. https://otexts.com/fpp3/</w:t>
+            </w:r>
+          </w:p>
+          <w:p>
+            <w:pPr>
+              <w:spacing w:after="120"/>
+              <w:ind w:left="720" w:hanging="720"/>
+            </w:pPr>
+            <w:r>
+              <w:rPr>
+                <w:rFonts w:cs="Times New Roman"/>
+              </w:rPr>
+              <w:t xml:space="preserve">Koenker, R., &amp; Bassett, G. (1978). Regression quantiles. </w:t>
+            </w:r>
+            <w:r>
+              <w:rPr>
+                <w:i/>
+              </w:rPr>
+              <w:t>Econometrica, 46</w:t>
+            </w:r>
+            <w:r>
+              <w:t>(1), 33–50. https://doi.org/10.2307/1913643</w:t>
+            </w:r>
+          </w:p>
+          <w:p>
+            <w:pPr>
+              <w:spacing w:after="120"/>
+              <w:ind w:left="720" w:hanging="720"/>
+            </w:pPr>
+            <w:r>
+              <w:rPr>
+                <w:rFonts w:cs="Times New Roman"/>
+              </w:rPr>
+              <w:t xml:space="preserve">Laimighofer, J., Melcher, M., &amp; Laaha, G. (2022). Low-flow estimation beyond the mean – expectile loss and extreme gradient boosting for spatiotemporal low-flow prediction in Austria. </w:t>
+            </w:r>
+            <w:r>
+              <w:rPr>
+                <w:i/>
+              </w:rPr>
+              <w:t>Hydrology and Earth System Sciences, 26</w:t>
+            </w:r>
+            <w:r>
+              <w:t>(17), 4553–4574. https://doi.org/10.5194/hess-26-4553-2022</w:t>
+            </w:r>
+          </w:p>
+          <w:p>
+            <w:pPr>
+              <w:spacing w:after="120"/>
+              <w:ind w:left="720" w:hanging="720"/>
+            </w:pPr>
+            <w:r>
+              <w:rPr>
+                <w:rFonts w:cs="Times New Roman"/>
+              </w:rPr>
+              <w:t xml:space="preserve">Masnadi-Shirazi, H., &amp; Vasconcelos, N. (2011). Cost-sensitive boosting. </w:t>
+            </w:r>
+            <w:r>
+              <w:rPr>
+                <w:i/>
+              </w:rPr>
+              <w:t>IEEE Transactions on Pattern Analysis and Machine Intelligence, 33</w:t>
+            </w:r>
+            <w:r>
+              <w:t>(2), 294–309. https://doi.org/10.1109/TPAMI.2010.71</w:t>
+            </w:r>
+          </w:p>
+          <w:p>
+            <w:pPr>
+              <w:spacing w:after="120"/>
+              <w:ind w:left="720" w:hanging="720"/>
+            </w:pPr>
+            <w:r>
+              <w:rPr>
+                <w:rFonts w:cs="Times New Roman"/>
+              </w:rPr>
               <w:t xml:space="preserve">Moore, W. R., &amp; van Vuuren, J. H. (2024). A framework for modelling customer invoice payment predictions. </w:t>
             </w:r>
             <w:r>
@@ -2484,6 +2589,27 @@
             </w:r>
             <w:r>
               <w:t>, Article 100578. https://doi.org/10.1016/j.mlwa.2024.100578</w:t>
+            </w:r>
+          </w:p>
+          <w:p>
+            <w:pPr>
+              <w:spacing w:after="120"/>
+              <w:ind w:left="720" w:hanging="720"/>
+            </w:pPr>
+            <w:r>
+              <w:rPr>
+                <w:rFonts w:cs="Times New Roman"/>
+              </w:rPr>
+              <w:t xml:space="preserve">Newey, W. K., &amp; Powell, J. L. (1987). Asymmetric least squares estimation and testing. </w:t>
+            </w:r>
+            <w:r>
+              <w:rPr>
+                <w:i/>
+              </w:rPr>
+              <w:t>Econometrica, 55</w:t>
+            </w:r>
+            <w:r>
+              <w:t>(4), 819–847. https://doi.org/10.2307/1911031</w:t>
             </w:r>
           </w:p>
           <w:p>

</xml_diff>

<commit_message>
Titles 2 and 3: state the data split
</commit_message>
<xml_diff>
--- a/Software Engineering 1/TS31_Statisfied_Title2_VMDaet_Proposal.docx
+++ b/Software Engineering 1/TS31_Statisfied_Title2_VMDaet_Proposal.docx
@@ -1348,7 +1348,7 @@
                       <w:rFonts w:cs="Times New Roman"/>
                       <w:sz w:val="22"/>
                     </w:rPr>
-                    <w:t xml:space="preserve">Expanding-window chronological evaluation over several forward windows, a final untouched test period, and no leakage (a payment outcome counts only once it is known). Metrics proposed with the algorithm: mean absolute error in days; the same weighted by billing amount; underprediction exposure U, meaning the billing amount times the days by which payment arrives later than predicted, added up (peso-days), and overprediction exposure O, the same for payment arriving earlier than predicted, so that a model cannot look good by predicting every payment very late; a balanced cost C = c_u x U + c_o x O in pesos, with c_u and c_o expressed as estimated cost per peso-day of exposure (for example a daily </w:t>
+                    <w:t xml:space="preserve">Expanding-window chronological evaluation over several forward windows, a final untouched test period (about 60% / 20% / 20% of the billings by billing date for training, validation and test), and no leakage (a payment outcome counts only once it is known). Metrics proposed with the algorithm: mean absolute error in days; the same weighted by billing amount; underprediction exposure U, meaning the billing amount times the days by which payment arrives later than predicted, added up (peso-days), and overprediction exposure O, the same for payment arriving earlier than predicted, so that a model cannot look good by predicting every payment very late; a balanced cost C = c_u x U + c_o x O in pesos, with c_u and c_o expressed as estimated cost per peso-day of exposure (for example a daily </w:t>
                   </w:r>
                   <w:r>
                     <w:rPr>
@@ -1522,7 +1522,7 @@
               <w:rPr>
                 <w:rFonts w:cs="Times New Roman"/>
               </w:rPr>
-              <w:t>Training and testing. Training uses an expanding window (Hyndman &amp; Athanasopoulos, 2021): at each training cutoff date only billings whose payment date is on or before the cutoff count as completed training examples, so a billing issued before the cutoff but paid after it is not used as a known outcome; the firm's past payment behaviour used as a predictor, the median billing amount and any scaling are computed from those billings only. Testing uses later billings, repeated over several forward windows (the number depends on how many billings exist), and a final test period is kept untouched until the model, k and the weight cap are fixed on validation windows.</w:t>
+              <w:t>Training and testing. Training uses an expanding window (Hyndman &amp; Athanasopoulos, 2021): at each training cutoff date only billings whose payment date is on or before the cutoff count as completed training examples, so a billing issued before the cutoff but paid after it is not used as a known outcome; the firm's past payment behaviour used as a predictor, the median billing amount and any scaling are computed from those billings only. Testing uses later billings, repeated over several forward windows (the number depends on how many billings exist), and a final test period is kept untouched until the model, k and the weight cap are fixed on validation windows. In numbers, the billings are split by billing date into about 60% for training, 20% for validation and 20% for the final untouched test period, and the training window expands over the forward windows.</w:t>
             </w:r>
           </w:p>
           <w:p>

</xml_diff>

<commit_message>
Title 2: 500+ billings with several rows each
</commit_message>
<xml_diff>
--- a/Software Engineering 1/TS31_Statisfied_Title2_VMDaet_Proposal.docx
+++ b/Software Engineering 1/TS31_Statisfied_Title2_VMDaet_Proposal.docx
@@ -1226,7 +1226,7 @@
                       <w:rFonts w:cs="Times New Roman"/>
                       <w:sz w:val="22"/>
                     </w:rPr>
-                    <w:t>About 2 years, up to the latest billing, with more than 500 progress billings, including billings not yet paid with the payment date left blank. Billing and payment dates, amounts and project for each progress billing, plus approval-stage dates if kept. Optional: material spending and project cost changes. No personal data.</w:t>
+                    <w:t>About 2 years, up to the latest billing, with more than 500 progress billings (several rows for each billing in the firm's files), including billings not yet paid with the payment date left blank. Billing and payment dates, amounts and project for each progress billing, plus approval-stage dates if kept. Optional: material spending and project cost changes. No personal data.</w:t>
                   </w:r>
                 </w:p>
               </w:tc>
@@ -1856,7 +1856,7 @@
               <w:rPr>
                 <w:rFonts w:cs="Times New Roman"/>
               </w:rPr>
-              <w:t>•  Records: about 2 years of billing and payment records, with more than 500 progress billings, confirmed by the firm. The data description in the study reports the exact years, fields, billings per month and paid versus unpaid counts. The number of forward windows and of compared variants is set by the number of usable billings, and intervals are reported.</w:t>
+              <w:t>•  Records: about 2 years of billing and payment records, with more than 500 progress billings, confirmed by the firm. Each billing has several rows in the firm's files, so the file has more rows than billings; the model learns from one case for each billing, and the data description reports both the number of rows and the number of billings. The data description in the study reports the exact years, fields, billings per month and paid versus unpaid counts. The number of forward windows and of compared variants is set by the number of usable billings, and intervals are reported.</w:t>
             </w:r>
           </w:p>
           <w:p>

</xml_diff>